<commit_message>
Archivo de investigacion terminado
</commit_message>
<xml_diff>
--- a/01_Investigacion/5.1ACTIVIDAD PRÁCTICACuestionarioRecopilarInformaciónBásicaCliente.docx
+++ b/01_Investigacion/5.1ACTIVIDAD PRÁCTICACuestionarioRecopilarInformaciónBásicaCliente.docx
@@ -1951,16 +1951,12 @@
         </w:rPr>
         <w:t>estilo?</w:t>
       </w:r>
-    </w:p>
-    <w:p>
-      <w:pPr>
-        <w:pStyle w:val="Prrafodelista"/>
-        <w:tabs>
-          <w:tab w:val="left" w:pos="479"/>
-        </w:tabs>
-        <w:spacing w:before="181"/>
-        <w:ind w:firstLine="0"/>
-      </w:pPr>
+      <w:r>
+        <w:rPr>
+          <w:spacing w:val="-2"/>
+        </w:rPr>
+        <w:t xml:space="preserve">                                                                       </w:t>
+      </w:r>
       <w:r>
         <w:rPr>
           <w:spacing w:val="-2"/>
@@ -2086,6 +2082,37 @@
         </w:rPr>
         <w:t>diseño?</w:t>
       </w:r>
+      <w:r>
+        <w:rPr>
+          <w:spacing w:val="-2"/>
+        </w:rPr>
+        <w:t xml:space="preserve"> </w:t>
+      </w:r>
+      <w:hyperlink r:id="rId8" w:history="1">
+        <w:r>
+          <w:rPr>
+            <w:rStyle w:val="Hipervnculo"/>
+          </w:rPr>
+          <w:t>https://www.pasteleriainglesa.com/</w:t>
+        </w:r>
+      </w:hyperlink>
+      <w:r>
+        <w:t xml:space="preserve"> </w:t>
+      </w:r>
+      <w:r>
+        <w:t>D</w:t>
+      </w:r>
+      <w:r>
+        <w:t xml:space="preserve">e esta pagina </w:t>
+      </w:r>
+      <w:r>
+        <w:t xml:space="preserve">los colores y el carrusel de </w:t>
+      </w:r>
+      <w:proofErr w:type="spellStart"/>
+      <w:r>
+        <w:t>imagenes</w:t>
+      </w:r>
+      <w:proofErr w:type="spellEnd"/>
     </w:p>
     <w:p>
       <w:pPr>
@@ -2185,6 +2212,18 @@
         </w:tabs>
         <w:ind w:left="262"/>
       </w:pPr>
+      <w:r>
+        <w:rPr>
+          <w:spacing w:val="-2"/>
+        </w:rPr>
+        <w:tab/>
+      </w:r>
+      <w:r>
+        <w:rPr>
+          <w:spacing w:val="-2"/>
+        </w:rPr>
+        <w:t xml:space="preserve">Colores pasteles y Tipografía tipo pastel </w:t>
+      </w:r>
     </w:p>
     <w:p>
       <w:pPr>
@@ -2262,9 +2301,19 @@
     </w:p>
     <w:p>
       <w:pPr>
-        <w:pStyle w:val="Textoindependiente"/>
-        <w:spacing w:before="94"/>
-      </w:pPr>
+        <w:pStyle w:val="Prrafodelista"/>
+        <w:tabs>
+          <w:tab w:val="left" w:pos="479"/>
+        </w:tabs>
+        <w:spacing w:before="37"/>
+        <w:ind w:firstLine="0"/>
+      </w:pPr>
+      <w:r>
+        <w:rPr>
+          <w:spacing w:val="-2"/>
+        </w:rPr>
+        <w:t>No tiene logo (YO LO CREO)</w:t>
+      </w:r>
     </w:p>
     <w:p>
       <w:pPr>
@@ -2389,362 +2438,16 @@
     <w:p>
       <w:pPr>
         <w:pStyle w:val="Prrafodelista"/>
-        <w:numPr>
-          <w:ilvl w:val="1"/>
-          <w:numId w:val="6"/>
-        </w:numPr>
         <w:tabs>
-          <w:tab w:val="left" w:pos="530"/>
+          <w:tab w:val="left" w:pos="479"/>
         </w:tabs>
-        <w:spacing w:before="183"/>
-        <w:ind w:hanging="117"/>
-      </w:pPr>
-      <w:r>
-        <w:t>Formularios</w:t>
-      </w:r>
-      <w:r>
-        <w:rPr>
-          <w:spacing w:val="-8"/>
-        </w:rPr>
-        <w:t xml:space="preserve"> </w:t>
-      </w:r>
-      <w:r>
-        <w:t>de</w:t>
-      </w:r>
-      <w:r>
-        <w:rPr>
-          <w:spacing w:val="-5"/>
-        </w:rPr>
-        <w:t xml:space="preserve"> </w:t>
-      </w:r>
-      <w:r>
-        <w:rPr>
-          <w:spacing w:val="-2"/>
-        </w:rPr>
-        <w:t>contacto</w:t>
-      </w:r>
-    </w:p>
-    <w:p>
-      <w:pPr>
-        <w:pStyle w:val="Prrafodelista"/>
-        <w:numPr>
-          <w:ilvl w:val="1"/>
-          <w:numId w:val="6"/>
-        </w:numPr>
-        <w:tabs>
-          <w:tab w:val="left" w:pos="530"/>
-        </w:tabs>
-        <w:ind w:hanging="117"/>
-      </w:pPr>
-      <w:r>
-        <w:t>Chat</w:t>
-      </w:r>
-      <w:r>
-        <w:rPr>
-          <w:spacing w:val="-8"/>
-        </w:rPr>
-        <w:t xml:space="preserve"> </w:t>
-      </w:r>
-      <w:r>
-        <w:t>en</w:t>
-      </w:r>
-      <w:r>
-        <w:rPr>
-          <w:spacing w:val="-5"/>
-        </w:rPr>
-        <w:t xml:space="preserve"> </w:t>
-      </w:r>
+        <w:ind w:firstLine="0"/>
+      </w:pPr>
       <w:r>
         <w:rPr>
           <w:spacing w:val="-4"/>
         </w:rPr>
-        <w:t>vivo</w:t>
-      </w:r>
-    </w:p>
-    <w:p>
-      <w:pPr>
-        <w:pStyle w:val="Prrafodelista"/>
-        <w:numPr>
-          <w:ilvl w:val="1"/>
-          <w:numId w:val="6"/>
-        </w:numPr>
-        <w:tabs>
-          <w:tab w:val="left" w:pos="530"/>
-        </w:tabs>
-        <w:spacing w:before="183"/>
-        <w:ind w:hanging="117"/>
-      </w:pPr>
-      <w:r>
-        <w:t>Integración</w:t>
-      </w:r>
-      <w:r>
-        <w:rPr>
-          <w:spacing w:val="-10"/>
-        </w:rPr>
-        <w:t xml:space="preserve"> </w:t>
-      </w:r>
-      <w:r>
-        <w:t>con</w:t>
-      </w:r>
-      <w:r>
-        <w:rPr>
-          <w:spacing w:val="-10"/>
-        </w:rPr>
-        <w:t xml:space="preserve"> </w:t>
-      </w:r>
-      <w:r>
-        <w:t>redes</w:t>
-      </w:r>
-      <w:r>
-        <w:rPr>
-          <w:spacing w:val="-9"/>
-        </w:rPr>
-        <w:t xml:space="preserve"> </w:t>
-      </w:r>
-      <w:r>
-        <w:rPr>
-          <w:spacing w:val="-2"/>
-        </w:rPr>
-        <w:t>sociales</w:t>
-      </w:r>
-    </w:p>
-    <w:p>
-      <w:pPr>
-        <w:pStyle w:val="Prrafodelista"/>
-        <w:numPr>
-          <w:ilvl w:val="1"/>
-          <w:numId w:val="6"/>
-        </w:numPr>
-        <w:tabs>
-          <w:tab w:val="left" w:pos="530"/>
-        </w:tabs>
-        <w:spacing w:before="181"/>
-        <w:ind w:hanging="117"/>
-      </w:pPr>
-      <w:r>
-        <w:t>Sistema</w:t>
-      </w:r>
-      <w:r>
-        <w:rPr>
-          <w:spacing w:val="-7"/>
-        </w:rPr>
-        <w:t xml:space="preserve"> </w:t>
-      </w:r>
-      <w:r>
-        <w:t>de</w:t>
-      </w:r>
-      <w:r>
-        <w:rPr>
-          <w:spacing w:val="-9"/>
-        </w:rPr>
-        <w:t xml:space="preserve"> </w:t>
-      </w:r>
-      <w:r>
-        <w:t>gestión</w:t>
-      </w:r>
-      <w:r>
-        <w:rPr>
-          <w:spacing w:val="-7"/>
-        </w:rPr>
-        <w:t xml:space="preserve"> </w:t>
-      </w:r>
-      <w:r>
-        <w:t>de</w:t>
-      </w:r>
-      <w:r>
-        <w:rPr>
-          <w:spacing w:val="-9"/>
-        </w:rPr>
-        <w:t xml:space="preserve"> </w:t>
-      </w:r>
-      <w:r>
-        <w:t>contenidos</w:t>
-      </w:r>
-      <w:r>
-        <w:rPr>
-          <w:spacing w:val="-9"/>
-        </w:rPr>
-        <w:t xml:space="preserve"> </w:t>
-      </w:r>
-      <w:r>
-        <w:rPr>
-          <w:spacing w:val="-4"/>
-        </w:rPr>
-        <w:t>(CMS)</w:t>
-      </w:r>
-    </w:p>
-    <w:p>
-      <w:pPr>
-        <w:pStyle w:val="Prrafodelista"/>
-        <w:numPr>
-          <w:ilvl w:val="1"/>
-          <w:numId w:val="6"/>
-        </w:numPr>
-        <w:tabs>
-          <w:tab w:val="left" w:pos="530"/>
-        </w:tabs>
-        <w:ind w:hanging="117"/>
-      </w:pPr>
-      <w:r>
-        <w:t>Foro</w:t>
-      </w:r>
-      <w:r>
-        <w:rPr>
-          <w:spacing w:val="-8"/>
-        </w:rPr>
-        <w:t xml:space="preserve"> </w:t>
-      </w:r>
-      <w:r>
-        <w:t>o</w:t>
-      </w:r>
-      <w:r>
-        <w:rPr>
-          <w:spacing w:val="-4"/>
-        </w:rPr>
-        <w:t xml:space="preserve"> </w:t>
-      </w:r>
-      <w:r>
-        <w:rPr>
-          <w:spacing w:val="-2"/>
-        </w:rPr>
-        <w:t>comunidad</w:t>
-      </w:r>
-    </w:p>
-    <w:p>
-      <w:pPr>
-        <w:pStyle w:val="Prrafodelista"/>
-        <w:numPr>
-          <w:ilvl w:val="1"/>
-          <w:numId w:val="6"/>
-        </w:numPr>
-        <w:tabs>
-          <w:tab w:val="left" w:pos="530"/>
-        </w:tabs>
-        <w:spacing w:before="183"/>
-        <w:ind w:hanging="117"/>
-      </w:pPr>
-      <w:r>
-        <w:rPr>
-          <w:spacing w:val="-2"/>
-        </w:rPr>
-        <w:t>Integración</w:t>
-      </w:r>
-      <w:r>
-        <w:t xml:space="preserve"> </w:t>
-      </w:r>
-      <w:r>
-        <w:rPr>
-          <w:spacing w:val="-2"/>
-        </w:rPr>
-        <w:t>con</w:t>
-      </w:r>
-      <w:r>
-        <w:t xml:space="preserve"> </w:t>
-      </w:r>
-      <w:r>
-        <w:rPr>
-          <w:spacing w:val="-2"/>
-        </w:rPr>
-        <w:t>herramientas</w:t>
-      </w:r>
-      <w:r>
-        <w:rPr>
-          <w:spacing w:val="1"/>
-        </w:rPr>
-        <w:t xml:space="preserve"> </w:t>
-      </w:r>
-      <w:r>
-        <w:rPr>
-          <w:spacing w:val="-2"/>
-        </w:rPr>
-        <w:t>de</w:t>
-      </w:r>
-      <w:r>
-        <w:rPr>
-          <w:spacing w:val="1"/>
-        </w:rPr>
-        <w:t xml:space="preserve"> </w:t>
-      </w:r>
-      <w:r>
-        <w:rPr>
-          <w:spacing w:val="-2"/>
-        </w:rPr>
-        <w:t>marketing</w:t>
-      </w:r>
-      <w:r>
-        <w:t xml:space="preserve"> </w:t>
-      </w:r>
-      <w:r>
-        <w:rPr>
-          <w:spacing w:val="-2"/>
-        </w:rPr>
-        <w:t>(</w:t>
-      </w:r>
-      <w:proofErr w:type="spellStart"/>
-      <w:r>
-        <w:rPr>
-          <w:spacing w:val="-2"/>
-        </w:rPr>
-        <w:t>newsletter</w:t>
-      </w:r>
-      <w:proofErr w:type="spellEnd"/>
-      <w:r>
-        <w:rPr>
-          <w:spacing w:val="-2"/>
-        </w:rPr>
-        <w:t>,</w:t>
-      </w:r>
-      <w:r>
-        <w:rPr>
-          <w:spacing w:val="2"/>
-        </w:rPr>
-        <w:t xml:space="preserve"> </w:t>
-      </w:r>
-      <w:r>
-        <w:rPr>
-          <w:spacing w:val="-2"/>
-        </w:rPr>
-        <w:t>CRM,</w:t>
-      </w:r>
-      <w:r>
-        <w:rPr>
-          <w:spacing w:val="1"/>
-        </w:rPr>
-        <w:t xml:space="preserve"> </w:t>
-      </w:r>
-      <w:r>
-        <w:rPr>
-          <w:spacing w:val="-2"/>
-        </w:rPr>
-        <w:t>etc.)</w:t>
-      </w:r>
-    </w:p>
-    <w:p>
-      <w:pPr>
-        <w:pStyle w:val="Prrafodelista"/>
-        <w:numPr>
-          <w:ilvl w:val="1"/>
-          <w:numId w:val="6"/>
-        </w:numPr>
-        <w:tabs>
-          <w:tab w:val="left" w:pos="530"/>
-        </w:tabs>
-        <w:ind w:hanging="117"/>
-      </w:pPr>
-      <w:r>
-        <w:t>Otro</w:t>
-      </w:r>
-      <w:r>
-        <w:rPr>
-          <w:spacing w:val="-7"/>
-        </w:rPr>
-        <w:t xml:space="preserve"> </w:t>
-      </w:r>
-      <w:r>
-        <w:rPr>
-          <w:spacing w:val="-2"/>
-        </w:rPr>
-        <w:t>(especificar)</w:t>
+        <w:t xml:space="preserve">Pasteles personalizados y preguntar si lo recoge en la tienda o en se lo envían a la casa </w:t>
       </w:r>
     </w:p>
     <w:p>
@@ -2815,6 +2518,22 @@
     <w:p>
       <w:pPr>
         <w:pStyle w:val="Prrafodelista"/>
+        <w:tabs>
+          <w:tab w:val="left" w:pos="479"/>
+        </w:tabs>
+        <w:spacing w:before="182"/>
+        <w:ind w:firstLine="0"/>
+      </w:pPr>
+      <w:r>
+        <w:rPr>
+          <w:spacing w:val="-2"/>
+        </w:rPr>
+        <w:t>no</w:t>
+      </w:r>
+    </w:p>
+    <w:p>
+      <w:pPr>
+        <w:pStyle w:val="Prrafodelista"/>
         <w:numPr>
           <w:ilvl w:val="0"/>
           <w:numId w:val="6"/>
@@ -2924,13 +2643,16 @@
     </w:p>
     <w:p>
       <w:pPr>
-        <w:pStyle w:val="Prrafodelista"/>
+        <w:ind w:firstLine="479"/>
         <w:sectPr>
           <w:pgSz w:w="12240" w:h="15840"/>
           <w:pgMar w:top="2180" w:right="1800" w:bottom="280" w:left="1440" w:header="332" w:footer="0" w:gutter="0"/>
           <w:cols w:space="720"/>
         </w:sectPr>
       </w:pPr>
+      <w:r>
+        <w:t>no</w:t>
+      </w:r>
     </w:p>
     <w:p>
       <w:pPr>
@@ -3131,6 +2853,25 @@
     <w:p>
       <w:pPr>
         <w:pStyle w:val="Prrafodelista"/>
+        <w:tabs>
+          <w:tab w:val="left" w:pos="479"/>
+        </w:tabs>
+        <w:spacing w:before="181"/>
+        <w:ind w:firstLine="0"/>
+      </w:pPr>
+      <w:r>
+        <w:t>Que sea intuitiva y que los pasteles le</w:t>
+      </w:r>
+      <w:r>
+        <w:t>s</w:t>
+      </w:r>
+      <w:r>
+        <w:t xml:space="preserve"> parezcan atractivos </w:t>
+      </w:r>
+    </w:p>
+    <w:p>
+      <w:pPr>
+        <w:pStyle w:val="Prrafodelista"/>
         <w:numPr>
           <w:ilvl w:val="0"/>
           <w:numId w:val="5"/>
@@ -3223,6 +2964,22 @@
           <w:spacing w:val="-2"/>
         </w:rPr>
         <w:t>etc.)?</w:t>
+      </w:r>
+    </w:p>
+    <w:p>
+      <w:pPr>
+        <w:pStyle w:val="Prrafodelista"/>
+        <w:tabs>
+          <w:tab w:val="left" w:pos="479"/>
+        </w:tabs>
+        <w:spacing w:before="182"/>
+        <w:ind w:firstLine="0"/>
+      </w:pPr>
+      <w:r>
+        <w:rPr>
+          <w:spacing w:val="-2"/>
+        </w:rPr>
+        <w:t>Menú principal que lleve a las diferentes paginas</w:t>
       </w:r>
     </w:p>
     <w:p>
@@ -3311,14 +3068,12 @@
     <w:p>
       <w:pPr>
         <w:pStyle w:val="Textoindependiente"/>
-        <w:spacing w:before="0"/>
-      </w:pPr>
-    </w:p>
-    <w:p>
-      <w:pPr>
-        <w:pStyle w:val="Textoindependiente"/>
         <w:spacing w:before="94"/>
-      </w:pPr>
+        <w:ind w:left="479"/>
+      </w:pPr>
+      <w:r>
+        <w:t>No</w:t>
+      </w:r>
     </w:p>
     <w:p>
       <w:pPr>
@@ -3483,6 +3238,22 @@
     <w:p>
       <w:pPr>
         <w:pStyle w:val="Prrafodelista"/>
+        <w:tabs>
+          <w:tab w:val="left" w:pos="479"/>
+        </w:tabs>
+        <w:spacing w:line="259" w:lineRule="auto"/>
+        <w:ind w:left="262" w:right="231" w:firstLine="0"/>
+      </w:pPr>
+      <w:r>
+        <w:rPr>
+          <w:spacing w:val="-2"/>
+        </w:rPr>
+        <w:t>No</w:t>
+      </w:r>
+    </w:p>
+    <w:p>
+      <w:pPr>
+        <w:pStyle w:val="Prrafodelista"/>
         <w:numPr>
           <w:ilvl w:val="0"/>
           <w:numId w:val="4"/>
@@ -3601,88 +3372,18 @@
     <w:p>
       <w:pPr>
         <w:pStyle w:val="Prrafodelista"/>
-        <w:numPr>
-          <w:ilvl w:val="0"/>
-          <w:numId w:val="4"/>
-        </w:numPr>
         <w:tabs>
           <w:tab w:val="left" w:pos="479"/>
         </w:tabs>
-        <w:spacing w:before="181"/>
-        <w:ind w:left="479" w:hanging="217"/>
-      </w:pPr>
-      <w:r>
-        <w:t>¿Requiere</w:t>
-      </w:r>
-      <w:r>
-        <w:rPr>
-          <w:spacing w:val="-12"/>
-        </w:rPr>
-        <w:t xml:space="preserve"> </w:t>
-      </w:r>
-      <w:r>
-        <w:t>hosting</w:t>
-      </w:r>
-      <w:r>
-        <w:rPr>
-          <w:spacing w:val="-11"/>
-        </w:rPr>
-        <w:t xml:space="preserve"> </w:t>
-      </w:r>
-      <w:r>
-        <w:t>y</w:t>
-      </w:r>
-      <w:r>
-        <w:rPr>
-          <w:spacing w:val="-10"/>
-        </w:rPr>
-        <w:t xml:space="preserve"> </w:t>
-      </w:r>
-      <w:r>
-        <w:t>mantenimiento</w:t>
-      </w:r>
-      <w:r>
-        <w:rPr>
-          <w:spacing w:val="-9"/>
-        </w:rPr>
-        <w:t xml:space="preserve"> </w:t>
-      </w:r>
-      <w:r>
-        <w:t>del</w:t>
-      </w:r>
-      <w:r>
-        <w:rPr>
-          <w:spacing w:val="-10"/>
-        </w:rPr>
-        <w:t xml:space="preserve"> </w:t>
-      </w:r>
-      <w:r>
-        <w:t>sitio</w:t>
-      </w:r>
-      <w:r>
-        <w:rPr>
-          <w:spacing w:val="-8"/>
-        </w:rPr>
-        <w:t xml:space="preserve"> </w:t>
-      </w:r>
-      <w:r>
-        <w:rPr>
-          <w:spacing w:val="-4"/>
-        </w:rPr>
-        <w:t>web?</w:t>
-      </w:r>
-    </w:p>
-    <w:p>
-      <w:pPr>
-        <w:pStyle w:val="Textoindependiente"/>
-        <w:spacing w:before="0"/>
-      </w:pPr>
-    </w:p>
-    <w:p>
-      <w:pPr>
-        <w:pStyle w:val="Textoindependiente"/>
-        <w:spacing w:before="94"/>
-      </w:pPr>
+        <w:spacing w:before="162"/>
+        <w:ind w:firstLine="0"/>
+      </w:pPr>
+      <w:r>
+        <w:rPr>
+          <w:spacing w:val="-2"/>
+        </w:rPr>
+        <w:t>Si</w:t>
+      </w:r>
     </w:p>
     <w:p>
       <w:pPr>
@@ -3844,6 +3545,21 @@
     <w:p>
       <w:pPr>
         <w:pStyle w:val="Prrafodelista"/>
+        <w:tabs>
+          <w:tab w:val="left" w:pos="979"/>
+        </w:tabs>
+        <w:ind w:left="979" w:firstLine="0"/>
+      </w:pPr>
+      <w:r>
+        <w:rPr>
+          <w:spacing w:val="-2"/>
+        </w:rPr>
+        <w:t>No</w:t>
+      </w:r>
+    </w:p>
+    <w:p>
+      <w:pPr>
+        <w:pStyle w:val="Prrafodelista"/>
         <w:numPr>
           <w:ilvl w:val="1"/>
           <w:numId w:val="4"/>
@@ -3963,6 +3679,22 @@
     <w:p>
       <w:pPr>
         <w:pStyle w:val="Prrafodelista"/>
+        <w:tabs>
+          <w:tab w:val="left" w:pos="479"/>
+        </w:tabs>
+        <w:spacing w:before="37"/>
+        <w:ind w:left="982" w:firstLine="0"/>
+      </w:pPr>
+      <w:r>
+        <w:rPr>
+          <w:spacing w:val="-2"/>
+        </w:rPr>
+        <w:t>Si</w:t>
+      </w:r>
+    </w:p>
+    <w:p>
+      <w:pPr>
+        <w:pStyle w:val="Prrafodelista"/>
         <w:numPr>
           <w:ilvl w:val="1"/>
           <w:numId w:val="4"/>
@@ -4090,541 +3822,18 @@
     </w:p>
     <w:p>
       <w:pPr>
-        <w:pStyle w:val="Ttulo1"/>
-      </w:pPr>
-      <w:r>
-        <w:t>Sección</w:t>
-      </w:r>
-      <w:r>
-        <w:rPr>
-          <w:spacing w:val="-5"/>
-        </w:rPr>
-        <w:t xml:space="preserve"> </w:t>
-      </w:r>
-      <w:r>
-        <w:t>10:</w:t>
-      </w:r>
-      <w:r>
-        <w:rPr>
-          <w:spacing w:val="-4"/>
-        </w:rPr>
-        <w:t xml:space="preserve"> </w:t>
-      </w:r>
-      <w:r>
-        <w:t>Tiempos</w:t>
-      </w:r>
-      <w:r>
-        <w:rPr>
-          <w:spacing w:val="-3"/>
-        </w:rPr>
-        <w:t xml:space="preserve"> </w:t>
-      </w:r>
-      <w:r>
-        <w:t>y</w:t>
-      </w:r>
-      <w:r>
-        <w:rPr>
-          <w:spacing w:val="-4"/>
-        </w:rPr>
-        <w:t xml:space="preserve"> </w:t>
-      </w:r>
-      <w:r>
-        <w:rPr>
-          <w:spacing w:val="-2"/>
-        </w:rPr>
-        <w:t>Presupuesto</w:t>
-      </w:r>
-    </w:p>
-    <w:p>
-      <w:pPr>
         <w:pStyle w:val="Prrafodelista"/>
-        <w:numPr>
-          <w:ilvl w:val="0"/>
-          <w:numId w:val="3"/>
-        </w:numPr>
         <w:tabs>
           <w:tab w:val="left" w:pos="479"/>
         </w:tabs>
-        <w:spacing w:before="183"/>
-        <w:ind w:left="479" w:hanging="217"/>
-      </w:pPr>
-      <w:r>
-        <w:t>¿Cuál</w:t>
-      </w:r>
-      <w:r>
-        <w:rPr>
-          <w:spacing w:val="-9"/>
-        </w:rPr>
-        <w:t xml:space="preserve"> </w:t>
-      </w:r>
-      <w:r>
-        <w:t>es</w:t>
-      </w:r>
-      <w:r>
-        <w:rPr>
-          <w:spacing w:val="-4"/>
-        </w:rPr>
-        <w:t xml:space="preserve"> </w:t>
-      </w:r>
-      <w:r>
-        <w:t>su</w:t>
-      </w:r>
-      <w:r>
-        <w:rPr>
-          <w:spacing w:val="-9"/>
-        </w:rPr>
-        <w:t xml:space="preserve"> </w:t>
-      </w:r>
-      <w:r>
-        <w:t>presupuesto</w:t>
-      </w:r>
-      <w:r>
-        <w:rPr>
-          <w:spacing w:val="-6"/>
-        </w:rPr>
-        <w:t xml:space="preserve"> </w:t>
-      </w:r>
-      <w:r>
-        <w:t>para</w:t>
-      </w:r>
-      <w:r>
-        <w:rPr>
-          <w:spacing w:val="-6"/>
-        </w:rPr>
-        <w:t xml:space="preserve"> </w:t>
-      </w:r>
-      <w:r>
-        <w:t>la</w:t>
-      </w:r>
-      <w:r>
-        <w:rPr>
-          <w:spacing w:val="-5"/>
-        </w:rPr>
-        <w:t xml:space="preserve"> </w:t>
-      </w:r>
-      <w:r>
-        <w:t>creación</w:t>
-      </w:r>
-      <w:r>
-        <w:rPr>
-          <w:spacing w:val="-6"/>
-        </w:rPr>
-        <w:t xml:space="preserve"> </w:t>
-      </w:r>
-      <w:r>
-        <w:t>del</w:t>
-      </w:r>
-      <w:r>
-        <w:rPr>
-          <w:spacing w:val="-6"/>
-        </w:rPr>
-        <w:t xml:space="preserve"> </w:t>
-      </w:r>
-      <w:r>
-        <w:t>sitio</w:t>
-      </w:r>
-      <w:r>
-        <w:rPr>
-          <w:spacing w:val="-4"/>
-        </w:rPr>
-        <w:t xml:space="preserve"> web?</w:t>
-      </w:r>
-    </w:p>
-    <w:p>
-      <w:pPr>
-        <w:pStyle w:val="Prrafodelista"/>
-        <w:numPr>
-          <w:ilvl w:val="0"/>
-          <w:numId w:val="3"/>
-        </w:numPr>
-        <w:tabs>
-          <w:tab w:val="left" w:pos="479"/>
-        </w:tabs>
-        <w:ind w:left="479" w:hanging="217"/>
-      </w:pPr>
-      <w:r>
-        <w:t>¿Cuál</w:t>
-      </w:r>
-      <w:r>
-        <w:rPr>
-          <w:spacing w:val="-7"/>
-        </w:rPr>
-        <w:t xml:space="preserve"> </w:t>
-      </w:r>
-      <w:r>
-        <w:t>es</w:t>
-      </w:r>
-      <w:r>
-        <w:rPr>
-          <w:spacing w:val="-4"/>
-        </w:rPr>
-        <w:t xml:space="preserve"> </w:t>
-      </w:r>
-      <w:r>
-        <w:t>la</w:t>
-      </w:r>
-      <w:r>
-        <w:rPr>
-          <w:spacing w:val="-7"/>
-        </w:rPr>
-        <w:t xml:space="preserve"> </w:t>
-      </w:r>
-      <w:r>
-        <w:t>fecha</w:t>
-      </w:r>
-      <w:r>
-        <w:rPr>
-          <w:spacing w:val="-5"/>
-        </w:rPr>
-        <w:t xml:space="preserve"> </w:t>
-      </w:r>
-      <w:r>
-        <w:t>límite</w:t>
-      </w:r>
-      <w:r>
-        <w:rPr>
-          <w:spacing w:val="-6"/>
-        </w:rPr>
-        <w:t xml:space="preserve"> </w:t>
-      </w:r>
-      <w:r>
-        <w:t>o</w:t>
-      </w:r>
-      <w:r>
-        <w:rPr>
-          <w:spacing w:val="-6"/>
-        </w:rPr>
-        <w:t xml:space="preserve"> </w:t>
-      </w:r>
-      <w:r>
-        <w:t>plazo</w:t>
-      </w:r>
-      <w:r>
-        <w:rPr>
-          <w:spacing w:val="-3"/>
-        </w:rPr>
-        <w:t xml:space="preserve"> </w:t>
-      </w:r>
-      <w:r>
-        <w:t>deseado</w:t>
-      </w:r>
-      <w:r>
-        <w:rPr>
-          <w:spacing w:val="-6"/>
-        </w:rPr>
-        <w:t xml:space="preserve"> </w:t>
-      </w:r>
-      <w:r>
-        <w:t>para</w:t>
-      </w:r>
-      <w:r>
-        <w:rPr>
-          <w:spacing w:val="-4"/>
-        </w:rPr>
-        <w:t xml:space="preserve"> </w:t>
-      </w:r>
-      <w:r>
-        <w:t>la</w:t>
-      </w:r>
-      <w:r>
-        <w:rPr>
-          <w:spacing w:val="-7"/>
-        </w:rPr>
-        <w:t xml:space="preserve"> </w:t>
-      </w:r>
-      <w:r>
-        <w:t>finalización</w:t>
-      </w:r>
-      <w:r>
-        <w:rPr>
-          <w:spacing w:val="-5"/>
-        </w:rPr>
-        <w:t xml:space="preserve"> </w:t>
-      </w:r>
-      <w:r>
-        <w:t>del</w:t>
-      </w:r>
-      <w:r>
-        <w:rPr>
-          <w:spacing w:val="-5"/>
-        </w:rPr>
-        <w:t xml:space="preserve"> </w:t>
-      </w:r>
+        <w:ind w:left="982" w:firstLine="0"/>
+      </w:pPr>
       <w:r>
         <w:rPr>
           <w:spacing w:val="-2"/>
         </w:rPr>
-        <w:t>proyecto?</w:t>
-      </w:r>
-    </w:p>
-    <w:p>
-      <w:pPr>
-        <w:pStyle w:val="Textoindependiente"/>
-        <w:spacing w:before="95"/>
-      </w:pPr>
-    </w:p>
-    <w:p>
-      <w:pPr>
-        <w:pStyle w:val="Ttulo1"/>
-      </w:pPr>
-      <w:r>
-        <w:t>Sección</w:t>
-      </w:r>
-      <w:r>
-        <w:rPr>
-          <w:spacing w:val="-8"/>
-        </w:rPr>
-        <w:t xml:space="preserve"> </w:t>
-      </w:r>
-      <w:r>
-        <w:t>11:</w:t>
-      </w:r>
-      <w:r>
-        <w:rPr>
-          <w:spacing w:val="-7"/>
-        </w:rPr>
-        <w:t xml:space="preserve"> </w:t>
-      </w:r>
-      <w:r>
-        <w:t>Mantenimiento</w:t>
-      </w:r>
-      <w:r>
-        <w:rPr>
-          <w:spacing w:val="-8"/>
-        </w:rPr>
-        <w:t xml:space="preserve"> </w:t>
-      </w:r>
-      <w:r>
-        <w:t>y</w:t>
-      </w:r>
-      <w:r>
-        <w:rPr>
-          <w:spacing w:val="-5"/>
-        </w:rPr>
-        <w:t xml:space="preserve"> </w:t>
-      </w:r>
-      <w:r>
-        <w:rPr>
-          <w:spacing w:val="-2"/>
-        </w:rPr>
-        <w:t>Soporte</w:t>
-      </w:r>
-    </w:p>
-    <w:p>
-      <w:pPr>
-        <w:pStyle w:val="Prrafodelista"/>
-        <w:numPr>
-          <w:ilvl w:val="0"/>
-          <w:numId w:val="2"/>
-        </w:numPr>
-        <w:tabs>
-          <w:tab w:val="left" w:pos="479"/>
-        </w:tabs>
-        <w:ind w:left="479" w:hanging="217"/>
-      </w:pPr>
-      <w:r>
-        <w:t>¿Quién</w:t>
-      </w:r>
-      <w:r>
-        <w:rPr>
-          <w:spacing w:val="-6"/>
-        </w:rPr>
-        <w:t xml:space="preserve"> </w:t>
-      </w:r>
-      <w:r>
-        <w:t>será</w:t>
-      </w:r>
-      <w:r>
-        <w:rPr>
-          <w:spacing w:val="-9"/>
-        </w:rPr>
-        <w:t xml:space="preserve"> </w:t>
-      </w:r>
-      <w:r>
-        <w:t>responsable</w:t>
-      </w:r>
-      <w:r>
-        <w:rPr>
-          <w:spacing w:val="-8"/>
-        </w:rPr>
-        <w:t xml:space="preserve"> </w:t>
-      </w:r>
-      <w:r>
-        <w:t>del</w:t>
-      </w:r>
-      <w:r>
-        <w:rPr>
-          <w:spacing w:val="-6"/>
-        </w:rPr>
-        <w:t xml:space="preserve"> </w:t>
-      </w:r>
-      <w:r>
-        <w:t>mantenimiento</w:t>
-      </w:r>
-      <w:r>
-        <w:rPr>
-          <w:spacing w:val="-7"/>
-        </w:rPr>
-        <w:t xml:space="preserve"> </w:t>
-      </w:r>
-      <w:r>
-        <w:t>del</w:t>
-      </w:r>
-      <w:r>
-        <w:rPr>
-          <w:spacing w:val="-6"/>
-        </w:rPr>
-        <w:t xml:space="preserve"> </w:t>
-      </w:r>
-      <w:r>
-        <w:t>sitio</w:t>
-      </w:r>
-      <w:r>
-        <w:rPr>
-          <w:spacing w:val="-5"/>
-        </w:rPr>
-        <w:t xml:space="preserve"> </w:t>
-      </w:r>
-      <w:r>
-        <w:t>web</w:t>
-      </w:r>
-      <w:r>
-        <w:rPr>
-          <w:spacing w:val="-5"/>
-        </w:rPr>
-        <w:t xml:space="preserve"> </w:t>
-      </w:r>
-      <w:r>
-        <w:t>una</w:t>
-      </w:r>
-      <w:r>
-        <w:rPr>
-          <w:spacing w:val="-6"/>
-        </w:rPr>
-        <w:t xml:space="preserve"> </w:t>
-      </w:r>
-      <w:r>
-        <w:t>vez</w:t>
-      </w:r>
-      <w:r>
-        <w:rPr>
-          <w:spacing w:val="-7"/>
-        </w:rPr>
-        <w:t xml:space="preserve"> </w:t>
-      </w:r>
-      <w:r>
-        <w:t>que</w:t>
-      </w:r>
-      <w:r>
-        <w:rPr>
-          <w:spacing w:val="-5"/>
-        </w:rPr>
-        <w:t xml:space="preserve"> </w:t>
-      </w:r>
-      <w:r>
-        <w:t>esté</w:t>
-      </w:r>
-      <w:r>
-        <w:rPr>
-          <w:spacing w:val="-8"/>
-        </w:rPr>
-        <w:t xml:space="preserve"> </w:t>
-      </w:r>
-      <w:r>
-        <w:t>en</w:t>
-      </w:r>
-      <w:r>
-        <w:rPr>
-          <w:spacing w:val="-8"/>
-        </w:rPr>
-        <w:t xml:space="preserve"> </w:t>
-      </w:r>
-      <w:r>
-        <w:rPr>
-          <w:spacing w:val="-2"/>
-        </w:rPr>
-        <w:t>funcionamiento?</w:t>
-      </w:r>
-    </w:p>
-    <w:p>
-      <w:pPr>
-        <w:pStyle w:val="Prrafodelista"/>
-        <w:numPr>
-          <w:ilvl w:val="0"/>
-          <w:numId w:val="2"/>
-        </w:numPr>
-        <w:tabs>
-          <w:tab w:val="left" w:pos="479"/>
-        </w:tabs>
-        <w:spacing w:before="183"/>
-        <w:ind w:left="479" w:hanging="217"/>
-      </w:pPr>
-      <w:r>
-        <w:t>¿Requiere</w:t>
-      </w:r>
-      <w:r>
-        <w:rPr>
-          <w:spacing w:val="-9"/>
-        </w:rPr>
-        <w:t xml:space="preserve"> </w:t>
-      </w:r>
-      <w:r>
-        <w:t>soporte</w:t>
-      </w:r>
-      <w:r>
-        <w:rPr>
-          <w:spacing w:val="-11"/>
-        </w:rPr>
-        <w:t xml:space="preserve"> </w:t>
-      </w:r>
-      <w:r>
-        <w:t>técnico</w:t>
-      </w:r>
-      <w:r>
-        <w:rPr>
-          <w:spacing w:val="-8"/>
-        </w:rPr>
-        <w:t xml:space="preserve"> </w:t>
-      </w:r>
-      <w:r>
-        <w:t>continuo</w:t>
-      </w:r>
-      <w:r>
-        <w:rPr>
-          <w:spacing w:val="-8"/>
-        </w:rPr>
-        <w:t xml:space="preserve"> </w:t>
-      </w:r>
-      <w:r>
-        <w:t>después</w:t>
-      </w:r>
-      <w:r>
-        <w:rPr>
-          <w:spacing w:val="-11"/>
-        </w:rPr>
-        <w:t xml:space="preserve"> </w:t>
-      </w:r>
-      <w:r>
-        <w:t>del</w:t>
-      </w:r>
-      <w:r>
-        <w:rPr>
-          <w:spacing w:val="-9"/>
-        </w:rPr>
-        <w:t xml:space="preserve"> </w:t>
-      </w:r>
-      <w:r>
-        <w:rPr>
-          <w:spacing w:val="-2"/>
-        </w:rPr>
-        <w:t>lanzamiento?</w:t>
-      </w:r>
-    </w:p>
-    <w:p>
-      <w:pPr>
-        <w:pStyle w:val="Textoindependiente"/>
-        <w:spacing w:before="0"/>
-      </w:pPr>
+        <w:t>Si</w:t>
+      </w:r>
     </w:p>
     <w:p>
       <w:pPr>
@@ -4646,7 +3855,13 @@
         <w:t xml:space="preserve"> </w:t>
       </w:r>
       <w:r>
-        <w:t>12:</w:t>
+        <w:t>1</w:t>
+      </w:r>
+      <w:r>
+        <w:t>0</w:t>
+      </w:r>
+      <w:r>
+        <w:t>:</w:t>
       </w:r>
       <w:r>
         <w:rPr>
@@ -4817,6 +4032,22 @@
           <w:spacing w:val="-4"/>
         </w:rPr>
         <w:t>web?</w:t>
+      </w:r>
+    </w:p>
+    <w:p>
+      <w:pPr>
+        <w:pStyle w:val="Prrafodelista"/>
+        <w:tabs>
+          <w:tab w:val="left" w:pos="479"/>
+        </w:tabs>
+        <w:spacing w:before="181" w:line="259" w:lineRule="auto"/>
+        <w:ind w:left="262" w:right="286" w:firstLine="0"/>
+      </w:pPr>
+      <w:r>
+        <w:rPr>
+          <w:spacing w:val="-4"/>
+        </w:rPr>
+        <w:t xml:space="preserve">No solo que sea bonito y que me guste que respete los colores </w:t>
       </w:r>
     </w:p>
     <w:sectPr>
@@ -4878,6 +4109,7 @@
     </w:pPr>
     <w:r>
       <w:rPr>
+        <w:noProof/>
         <w:sz w:val="20"/>
       </w:rPr>
       <mc:AlternateContent>
@@ -4962,7 +4194,7 @@
         </mc:Choice>
         <mc:Fallback>
           <w:pict>
-            <v:group w14:anchorId="6582CA34" id="Group 1" o:spid="_x0000_s1026" style="position:absolute;margin-left:86.3pt;margin-top:16.6pt;width:161.9pt;height:93.65pt;z-index:-251660288;mso-wrap-distance-left:0;mso-wrap-distance-right:0;mso-position-horizontal-relative:page;mso-position-vertical-relative:page" coordsize="20561,11893" o:gfxdata="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">
+            <v:group w14:anchorId="76A9651F" id="Group 1" o:spid="_x0000_s1026" style="position:absolute;margin-left:86.3pt;margin-top:16.6pt;width:161.9pt;height:93.65pt;z-index:-251660288;mso-wrap-distance-left:0;mso-wrap-distance-right:0;mso-position-horizontal-relative:page;mso-position-vertical-relative:page" coordsize="20561,11893" o:gfxdata="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">
               <v:shapetype id="_x0000_t75" coordsize="21600,21600" o:spt="75" o:preferrelative="t" path="m@4@5l@4@11@9@11@9@5xe" filled="f" stroked="f">
                 <v:stroke joinstyle="miter"/>
                 <v:formulas>
@@ -4996,6 +4228,7 @@
     </w:r>
     <w:r>
       <w:rPr>
+        <w:noProof/>
         <w:sz w:val="20"/>
       </w:rPr>
       <mc:AlternateContent>
@@ -7480,6 +6713,29 @@
       <w:lang w:val="es-ES"/>
     </w:rPr>
   </w:style>
+  <w:style w:type="character" w:styleId="Hipervnculo">
+    <w:name w:val="Hyperlink"/>
+    <w:basedOn w:val="Fuentedeprrafopredeter"/>
+    <w:uiPriority w:val="99"/>
+    <w:unhideWhenUsed/>
+    <w:rsid w:val="007D38B9"/>
+    <w:rPr>
+      <w:color w:val="0000FF" w:themeColor="hyperlink"/>
+      <w:u w:val="single"/>
+    </w:rPr>
+  </w:style>
+  <w:style w:type="character" w:styleId="Mencinsinresolver">
+    <w:name w:val="Unresolved Mention"/>
+    <w:basedOn w:val="Fuentedeprrafopredeter"/>
+    <w:uiPriority w:val="99"/>
+    <w:semiHidden/>
+    <w:unhideWhenUsed/>
+    <w:rsid w:val="007D38B9"/>
+    <w:rPr>
+      <w:color w:val="605E5C"/>
+      <w:shd w:val="clear" w:color="auto" w:fill="E1DFDD"/>
+    </w:rPr>
+  </w:style>
 </w:styles>
 </file>
 

</xml_diff>